<commit_message>
Auto-archive: Daily PIB UPSC Brief 2026-10-22
</commit_message>
<xml_diff>
--- a/output/PIB_UPSC_Daily_2026-10-21.docx
+++ b/output/PIB_UPSC_Daily_2026-10-21.docx
@@ -53,7 +53,7 @@
                 <w:b/>
                 <w:sz w:val="20"/>
               </w:rPr>
-              <w:t>DAILY SUMMARY: Scraped 22 total PIB releases today. Found 4 high-yield articles aligned with the UPSC syllabus (GS-2: 1, GS-3: 3).</w:t>
+              <w:t>DAILY SUMMARY: Scraped 69 total PIB releases today. Found 16 high-yield articles aligned with the UPSC syllabus (GS-1: 1, GS-2: 1, GS-3: 14).</w:t>
             </w:r>
           </w:p>
         </w:tc>
@@ -63,6 +63,86 @@
       <w:pPr>
         <w:spacing w:after="160"/>
       </w:pPr>
+    </w:p>
+    <w:p>
+      <w:pPr>
+        <w:spacing w:before="320" w:after="80"/>
+      </w:pPr>
+      <w:r>
+        <w:rPr>
+          <w:rFonts w:ascii="Arial" w:hAnsi="Arial"/>
+          <w:b/>
+          <w:color w:val="2563EB"/>
+          <w:sz w:val="26"/>
+        </w:rPr>
+        <w:t>■ General Studies 1: Indian Heritage, Culture, History, Society &amp; World Geography</w:t>
+      </w:r>
+    </w:p>
+    <w:p>
+      <w:pPr>
+        <w:spacing w:before="80" w:after="40"/>
+        <w:ind w:left="288"/>
+      </w:pPr>
+      <w:r>
+        <w:rPr>
+          <w:b/>
+        </w:rPr>
+        <w:t xml:space="preserve">1. </w:t>
+      </w:r>
+      <w:r>
+        <w:rPr>
+          <w:rFonts w:ascii="Calibri" w:hAnsi="Calibri"/>
+          <w:b/>
+          <w:sz w:val="23"/>
+        </w:rPr>
+        <w:t>Hon’ble President of India Smt. Droupadi Murmu presents 65th National Exhibition of Art and 3rd Print Biennale India awards to artists, celebrating India’s rich artistic heritage and contemporary creativity</w:t>
+        <w:br/>
+      </w:r>
+    </w:p>
+    <w:p>
+      <w:pPr>
+        <w:spacing w:after="40"/>
+        <w:ind w:left="576"/>
+      </w:pPr>
+      <w:r>
+        <w:rPr>
+          <w:i/>
+          <w:color w:val="64748B"/>
+          <w:sz w:val="19"/>
+        </w:rPr>
+        <w:t>Ministry: Ministry of Culture  |  Keywords: heritage</w:t>
+        <w:br/>
+      </w:r>
+      <w:r>
+        <w:rPr>
+          <w:b/>
+          <w:color w:val="1E40AF"/>
+          <w:sz w:val="20"/>
+        </w:rPr>
+        <w:t>UPSC Alignment: Aligned with General Studies 1 topics: heritage</w:t>
+        <w:br/>
+      </w:r>
+      <w:r>
+        <w:rPr>
+          <w:b/>
+          <w:color w:val="475569"/>
+          <w:sz w:val="18"/>
+        </w:rPr>
+        <w:t xml:space="preserve">Official PIB Link: </w:t>
+      </w:r>
+      <w:hyperlink r:id="rId9">
+        <w:r>
+          <w:rPr>
+            <w:color w:val="0284C7"/>
+            <w:u w:val="single"/>
+            <w:sz w:val="18"/>
+          </w:rPr>
+          <w:t>https://www.pib.gov.in/PressReleaseDetail.aspx?PRID=2326116</w:t>
+        </w:r>
+      </w:hyperlink>
+      <w:r>
+        <w:br/>
+      </w:r>
     </w:p>
     <w:p>
       <w:pPr>
@@ -130,7 +210,7 @@
         </w:rPr>
         <w:t xml:space="preserve">Official PIB Link: </w:t>
       </w:r>
-      <w:hyperlink r:id="rId9">
+      <w:hyperlink r:id="rId10">
         <w:r>
           <w:rPr>
             <w:color w:val="0284C7"/>
@@ -168,6 +248,144 @@
           <w:b/>
         </w:rPr>
         <w:t xml:space="preserve">1. </w:t>
+      </w:r>
+      <w:r>
+        <w:rPr>
+          <w:rFonts w:ascii="Calibri" w:hAnsi="Calibri"/>
+          <w:b/>
+          <w:sz w:val="23"/>
+        </w:rPr>
+        <w:t>“Solar panels above, thriving crops below”: Union Minister Shri Shivraj Singh Chouhan inaugurates the 7th AgriVoltaics World Conference at Bharat Mandapam</w:t>
+        <w:br/>
+      </w:r>
+    </w:p>
+    <w:p>
+      <w:pPr>
+        <w:spacing w:after="40"/>
+        <w:ind w:left="576"/>
+      </w:pPr>
+      <w:r>
+        <w:rPr>
+          <w:i/>
+          <w:color w:val="64748B"/>
+          <w:sz w:val="19"/>
+        </w:rPr>
+        <w:t>Ministry: Ministry of Agriculture &amp;</w:t>
+        <w:br/>
+        <w:br/>
+        <w:t>Farmers Welfare  |  Keywords: agriculture</w:t>
+        <w:br/>
+      </w:r>
+      <w:r>
+        <w:rPr>
+          <w:b/>
+          <w:color w:val="1E40AF"/>
+          <w:sz w:val="20"/>
+        </w:rPr>
+        <w:t>UPSC Alignment: Aligned with General Studies 3 topics: agriculture</w:t>
+        <w:br/>
+      </w:r>
+      <w:r>
+        <w:rPr>
+          <w:b/>
+          <w:color w:val="475569"/>
+          <w:sz w:val="18"/>
+        </w:rPr>
+        <w:t xml:space="preserve">Official PIB Link: </w:t>
+      </w:r>
+      <w:hyperlink r:id="rId11">
+        <w:r>
+          <w:rPr>
+            <w:color w:val="0284C7"/>
+            <w:u w:val="single"/>
+            <w:sz w:val="18"/>
+          </w:rPr>
+          <w:t>https://www.pib.gov.in/PressReleaseDetail.aspx?PRID=2326152</w:t>
+        </w:r>
+      </w:hyperlink>
+      <w:r>
+        <w:br/>
+      </w:r>
+    </w:p>
+    <w:p>
+      <w:pPr>
+        <w:spacing w:before="80" w:after="40"/>
+        <w:ind w:left="288"/>
+      </w:pPr>
+      <w:r>
+        <w:rPr>
+          <w:b/>
+        </w:rPr>
+        <w:t xml:space="preserve">2. </w:t>
+      </w:r>
+      <w:r>
+        <w:rPr>
+          <w:rFonts w:ascii="Calibri" w:hAnsi="Calibri"/>
+          <w:b/>
+          <w:sz w:val="23"/>
+        </w:rPr>
+        <w:t>Ministry of Agriculture &amp; Farmers Welfare to Launch ‘Khet Bachao Abhiyan – Rabi 2026’ tomorrow; Campaign to Continue Till 30 November</w:t>
+        <w:br/>
+      </w:r>
+    </w:p>
+    <w:p>
+      <w:pPr>
+        <w:spacing w:after="40"/>
+        <w:ind w:left="576"/>
+      </w:pPr>
+      <w:r>
+        <w:rPr>
+          <w:i/>
+          <w:color w:val="64748B"/>
+          <w:sz w:val="19"/>
+        </w:rPr>
+        <w:t>Ministry: Ministry of Agriculture &amp;</w:t>
+        <w:br/>
+        <w:br/>
+        <w:t>Farmers Welfare  |  Keywords: agriculture</w:t>
+        <w:br/>
+      </w:r>
+      <w:r>
+        <w:rPr>
+          <w:b/>
+          <w:color w:val="1E40AF"/>
+          <w:sz w:val="20"/>
+        </w:rPr>
+        <w:t>UPSC Alignment: Aligned with General Studies 3 topics: agriculture</w:t>
+        <w:br/>
+      </w:r>
+      <w:r>
+        <w:rPr>
+          <w:b/>
+          <w:color w:val="475569"/>
+          <w:sz w:val="18"/>
+        </w:rPr>
+        <w:t xml:space="preserve">Official PIB Link: </w:t>
+      </w:r>
+      <w:hyperlink r:id="rId12">
+        <w:r>
+          <w:rPr>
+            <w:color w:val="0284C7"/>
+            <w:u w:val="single"/>
+            <w:sz w:val="18"/>
+          </w:rPr>
+          <w:t>https://www.pib.gov.in/PressReleaseDetail.aspx?PRID=2326112</w:t>
+        </w:r>
+      </w:hyperlink>
+      <w:r>
+        <w:br/>
+      </w:r>
+    </w:p>
+    <w:p>
+      <w:pPr>
+        <w:spacing w:before="80" w:after="40"/>
+        <w:ind w:left="288"/>
+      </w:pPr>
+      <w:r>
+        <w:rPr>
+          <w:b/>
+        </w:rPr>
+        <w:t xml:space="preserve">3. </w:t>
       </w:r>
       <w:r>
         <w:rPr>
@@ -213,7 +431,7 @@
         </w:rPr>
         <w:t xml:space="preserve">Official PIB Link: </w:t>
       </w:r>
-      <w:hyperlink r:id="rId10">
+      <w:hyperlink r:id="rId13">
         <w:r>
           <w:rPr>
             <w:color w:val="0284C7"/>
@@ -236,7 +454,205 @@
         <w:rPr>
           <w:b/>
         </w:rPr>
-        <w:t xml:space="preserve">2. </w:t>
+        <w:t xml:space="preserve">4. </w:t>
+      </w:r>
+      <w:r>
+        <w:rPr>
+          <w:rFonts w:ascii="Calibri" w:hAnsi="Calibri"/>
+          <w:b/>
+          <w:sz w:val="23"/>
+        </w:rPr>
+        <w:t>33rd EDITION OF SINGAPORE-INDIA MARITIME BILATERAL EXERCISE (SIMBEX-2026) COMMENCES AT VISAKHAPATNAM</w:t>
+        <w:br/>
+      </w:r>
+    </w:p>
+    <w:p>
+      <w:pPr>
+        <w:spacing w:after="40"/>
+        <w:ind w:left="576"/>
+      </w:pPr>
+      <w:r>
+        <w:rPr>
+          <w:i/>
+          <w:color w:val="64748B"/>
+          <w:sz w:val="19"/>
+        </w:rPr>
+        <w:t>Ministry: Ministry of Defence  |  Keywords: bilateral exercise</w:t>
+        <w:br/>
+      </w:r>
+      <w:r>
+        <w:rPr>
+          <w:b/>
+          <w:color w:val="1E40AF"/>
+          <w:sz w:val="20"/>
+        </w:rPr>
+        <w:t>UPSC Alignment: Aligned with General Studies 3 topics: bilateral exercise</w:t>
+        <w:br/>
+      </w:r>
+      <w:r>
+        <w:rPr>
+          <w:b/>
+          <w:color w:val="475569"/>
+          <w:sz w:val="18"/>
+        </w:rPr>
+        <w:t xml:space="preserve">Official PIB Link: </w:t>
+      </w:r>
+      <w:hyperlink r:id="rId14">
+        <w:r>
+          <w:rPr>
+            <w:color w:val="0284C7"/>
+            <w:u w:val="single"/>
+            <w:sz w:val="18"/>
+          </w:rPr>
+          <w:t>https://www.pib.gov.in/PressReleaseDetail.aspx?PRID=2326348</w:t>
+        </w:r>
+      </w:hyperlink>
+      <w:r>
+        <w:br/>
+      </w:r>
+    </w:p>
+    <w:p>
+      <w:pPr>
+        <w:spacing w:before="80" w:after="40"/>
+        <w:ind w:left="288"/>
+      </w:pPr>
+      <w:r>
+        <w:rPr>
+          <w:b/>
+        </w:rPr>
+        <w:t xml:space="preserve">5. </w:t>
+      </w:r>
+      <w:r>
+        <w:rPr>
+          <w:rFonts w:ascii="Calibri" w:hAnsi="Calibri"/>
+          <w:b/>
+          <w:sz w:val="23"/>
+        </w:rPr>
+        <w:t>INDIAN AIR FORCE ENGAGES INDUSTRY OUTREACH PROGRAMME ON UNMANNED AND AUTONOMOUS SYSTEMS ROADMAP ON 21 OCT 26</w:t>
+        <w:br/>
+      </w:r>
+    </w:p>
+    <w:p>
+      <w:pPr>
+        <w:spacing w:after="40"/>
+        <w:ind w:left="576"/>
+      </w:pPr>
+      <w:r>
+        <w:rPr>
+          <w:i/>
+          <w:color w:val="64748B"/>
+          <w:sz w:val="19"/>
+        </w:rPr>
+        <w:t>Ministry: Ministry of Defence  |  Keywords: indian air force</w:t>
+        <w:br/>
+      </w:r>
+      <w:r>
+        <w:rPr>
+          <w:b/>
+          <w:color w:val="1E40AF"/>
+          <w:sz w:val="20"/>
+        </w:rPr>
+        <w:t>UPSC Alignment: Aligned with General Studies 3 topics: indian air force</w:t>
+        <w:br/>
+      </w:r>
+      <w:r>
+        <w:rPr>
+          <w:b/>
+          <w:color w:val="475569"/>
+          <w:sz w:val="18"/>
+        </w:rPr>
+        <w:t xml:space="preserve">Official PIB Link: </w:t>
+      </w:r>
+      <w:hyperlink r:id="rId15">
+        <w:r>
+          <w:rPr>
+            <w:color w:val="0284C7"/>
+            <w:u w:val="single"/>
+            <w:sz w:val="18"/>
+          </w:rPr>
+          <w:t>https://www.pib.gov.in/PressReleaseDetail.aspx?PRID=2326184</w:t>
+        </w:r>
+      </w:hyperlink>
+      <w:r>
+        <w:br/>
+      </w:r>
+    </w:p>
+    <w:p>
+      <w:pPr>
+        <w:spacing w:before="80" w:after="40"/>
+        <w:ind w:left="288"/>
+      </w:pPr>
+      <w:r>
+        <w:rPr>
+          <w:b/>
+        </w:rPr>
+        <w:t xml:space="preserve">6. </w:t>
+      </w:r>
+      <w:r>
+        <w:rPr>
+          <w:rFonts w:ascii="Calibri" w:hAnsi="Calibri"/>
+          <w:b/>
+          <w:sz w:val="23"/>
+        </w:rPr>
+        <w:t>CONCLUSION OF THE NINTH EDITION OF INDIA-BRAZIL-SOUTH AFRICA MARITIME EXERCISE (IBSAMAR IX 2026)</w:t>
+        <w:br/>
+      </w:r>
+    </w:p>
+    <w:p>
+      <w:pPr>
+        <w:spacing w:after="40"/>
+        <w:ind w:left="576"/>
+      </w:pPr>
+      <w:r>
+        <w:rPr>
+          <w:i/>
+          <w:color w:val="64748B"/>
+          <w:sz w:val="19"/>
+        </w:rPr>
+        <w:t>Ministry: Ministry of Defence  |  Keywords: Internal &amp; External Security</w:t>
+        <w:br/>
+      </w:r>
+      <w:r>
+        <w:rPr>
+          <w:b/>
+          <w:color w:val="1E40AF"/>
+          <w:sz w:val="20"/>
+        </w:rPr>
+        <w:t>UPSC Alignment: Strategic policy update from nodal ministry (Ministry of Defence): Internal &amp; External Security / Defence Capabilities</w:t>
+        <w:br/>
+      </w:r>
+      <w:r>
+        <w:rPr>
+          <w:b/>
+          <w:color w:val="475569"/>
+          <w:sz w:val="18"/>
+        </w:rPr>
+        <w:t xml:space="preserve">Official PIB Link: </w:t>
+      </w:r>
+      <w:hyperlink r:id="rId16">
+        <w:r>
+          <w:rPr>
+            <w:color w:val="0284C7"/>
+            <w:u w:val="single"/>
+            <w:sz w:val="18"/>
+          </w:rPr>
+          <w:t>https://www.pib.gov.in/PressReleaseDetail.aspx?PRID=2326117</w:t>
+        </w:r>
+      </w:hyperlink>
+      <w:r>
+        <w:br/>
+      </w:r>
+    </w:p>
+    <w:p>
+      <w:pPr>
+        <w:spacing w:before="80" w:after="40"/>
+        <w:ind w:left="288"/>
+      </w:pPr>
+      <w:r>
+        <w:rPr>
+          <w:b/>
+        </w:rPr>
+        <w:t xml:space="preserve">7. </w:t>
       </w:r>
       <w:r>
         <w:rPr>
@@ -279,7 +695,7 @@
         </w:rPr>
         <w:t xml:space="preserve">Official PIB Link: </w:t>
       </w:r>
-      <w:hyperlink r:id="rId11">
+      <w:hyperlink r:id="rId17">
         <w:r>
           <w:rPr>
             <w:color w:val="0284C7"/>
@@ -302,7 +718,403 @@
         <w:rPr>
           <w:b/>
         </w:rPr>
-        <w:t xml:space="preserve">3. </w:t>
+        <w:t xml:space="preserve">8. </w:t>
+      </w:r>
+      <w:r>
+        <w:rPr>
+          <w:rFonts w:ascii="Calibri" w:hAnsi="Calibri"/>
+          <w:b/>
+          <w:sz w:val="23"/>
+        </w:rPr>
+        <w:t>CAQM holds meeting with Delhi Government agencies to review Dust Pollution issues and strengthen Air Pollution Mitigation</w:t>
+        <w:br/>
+      </w:r>
+    </w:p>
+    <w:p>
+      <w:pPr>
+        <w:spacing w:after="40"/>
+        <w:ind w:left="576"/>
+      </w:pPr>
+      <w:r>
+        <w:rPr>
+          <w:i/>
+          <w:color w:val="64748B"/>
+          <w:sz w:val="19"/>
+        </w:rPr>
+        <w:t>Ministry: Ministry of Environment, Forest and Climate Change  |  Keywords: climate change, caqm</w:t>
+        <w:br/>
+      </w:r>
+      <w:r>
+        <w:rPr>
+          <w:b/>
+          <w:color w:val="1E40AF"/>
+          <w:sz w:val="20"/>
+        </w:rPr>
+        <w:t>UPSC Alignment: Aligned with General Studies 3 topics: climate change, caqm</w:t>
+        <w:br/>
+      </w:r>
+      <w:r>
+        <w:rPr>
+          <w:b/>
+          <w:color w:val="475569"/>
+          <w:sz w:val="18"/>
+        </w:rPr>
+        <w:t xml:space="preserve">Official PIB Link: </w:t>
+      </w:r>
+      <w:hyperlink r:id="rId18">
+        <w:r>
+          <w:rPr>
+            <w:color w:val="0284C7"/>
+            <w:u w:val="single"/>
+            <w:sz w:val="18"/>
+          </w:rPr>
+          <w:t>https://www.pib.gov.in/PressReleaseDetail.aspx?PRID=2326148</w:t>
+        </w:r>
+      </w:hyperlink>
+      <w:r>
+        <w:br/>
+      </w:r>
+    </w:p>
+    <w:p>
+      <w:pPr>
+        <w:spacing w:before="80" w:after="40"/>
+        <w:ind w:left="288"/>
+      </w:pPr>
+      <w:r>
+        <w:rPr>
+          <w:b/>
+        </w:rPr>
+        <w:t xml:space="preserve">9. </w:t>
+      </w:r>
+      <w:r>
+        <w:rPr>
+          <w:rFonts w:ascii="Calibri" w:hAnsi="Calibri"/>
+          <w:b/>
+          <w:sz w:val="23"/>
+        </w:rPr>
+        <w:t>CAQM invokes Stage-I of GRAP in Delhi-NCR with immediate effect amid sharp rise in AQI</w:t>
+        <w:br/>
+      </w:r>
+    </w:p>
+    <w:p>
+      <w:pPr>
+        <w:spacing w:after="40"/>
+        <w:ind w:left="576"/>
+      </w:pPr>
+      <w:r>
+        <w:rPr>
+          <w:i/>
+          <w:color w:val="64748B"/>
+          <w:sz w:val="19"/>
+        </w:rPr>
+        <w:t>Ministry: Ministry of Environment, Forest and Climate Change  |  Keywords: climate change, caqm</w:t>
+        <w:br/>
+      </w:r>
+      <w:r>
+        <w:rPr>
+          <w:b/>
+          <w:color w:val="1E40AF"/>
+          <w:sz w:val="20"/>
+        </w:rPr>
+        <w:t>UPSC Alignment: Aligned with General Studies 3 topics: climate change, caqm</w:t>
+        <w:br/>
+      </w:r>
+      <w:r>
+        <w:rPr>
+          <w:b/>
+          <w:color w:val="475569"/>
+          <w:sz w:val="18"/>
+        </w:rPr>
+        <w:t xml:space="preserve">Official PIB Link: </w:t>
+      </w:r>
+      <w:hyperlink r:id="rId19">
+        <w:r>
+          <w:rPr>
+            <w:color w:val="0284C7"/>
+            <w:u w:val="single"/>
+            <w:sz w:val="18"/>
+          </w:rPr>
+          <w:t>https://www.pib.gov.in/PressReleaseDetail.aspx?PRID=2326133</w:t>
+        </w:r>
+      </w:hyperlink>
+      <w:r>
+        <w:br/>
+      </w:r>
+    </w:p>
+    <w:p>
+      <w:pPr>
+        <w:spacing w:before="80" w:after="40"/>
+        <w:ind w:left="288"/>
+      </w:pPr>
+      <w:r>
+        <w:rPr>
+          <w:b/>
+        </w:rPr>
+        <w:t xml:space="preserve">10. </w:t>
+      </w:r>
+      <w:r>
+        <w:rPr>
+          <w:rFonts w:ascii="Calibri" w:hAnsi="Calibri"/>
+          <w:b/>
+          <w:sz w:val="23"/>
+        </w:rPr>
+        <w:t>India and New Zealand sign Memorandum of Cooperation (MoC) on Electronic Origin Data Exchange to Facilitate Bilateral Trade Under the India-New Zealand Free Trade Agreement (FTA)</w:t>
+        <w:br/>
+      </w:r>
+    </w:p>
+    <w:p>
+      <w:pPr>
+        <w:spacing w:after="40"/>
+        <w:ind w:left="576"/>
+      </w:pPr>
+      <w:r>
+        <w:rPr>
+          <w:i/>
+          <w:color w:val="64748B"/>
+          <w:sz w:val="19"/>
+        </w:rPr>
+        <w:t>Ministry: Ministry of Finance  |  Keywords: Economic Governance &amp; Fiscal Policy</w:t>
+        <w:br/>
+      </w:r>
+      <w:r>
+        <w:rPr>
+          <w:b/>
+          <w:color w:val="1E40AF"/>
+          <w:sz w:val="20"/>
+        </w:rPr>
+        <w:t>UPSC Alignment: Strategic policy update from nodal ministry (Ministry of Finance): Economic Governance &amp; Fiscal Policy</w:t>
+        <w:br/>
+      </w:r>
+      <w:r>
+        <w:rPr>
+          <w:b/>
+          <w:color w:val="475569"/>
+          <w:sz w:val="18"/>
+        </w:rPr>
+        <w:t xml:space="preserve">Official PIB Link: </w:t>
+      </w:r>
+      <w:hyperlink r:id="rId20">
+        <w:r>
+          <w:rPr>
+            <w:color w:val="0284C7"/>
+            <w:u w:val="single"/>
+            <w:sz w:val="18"/>
+          </w:rPr>
+          <w:t>https://www.pib.gov.in/PressReleaseDetail.aspx?PRID=2326043</w:t>
+        </w:r>
+      </w:hyperlink>
+      <w:r>
+        <w:br/>
+      </w:r>
+    </w:p>
+    <w:p>
+      <w:pPr>
+        <w:spacing w:before="80" w:after="40"/>
+        <w:ind w:left="288"/>
+      </w:pPr>
+      <w:r>
+        <w:rPr>
+          <w:b/>
+        </w:rPr>
+        <w:t xml:space="preserve">11. </w:t>
+      </w:r>
+      <w:r>
+        <w:rPr>
+          <w:rFonts w:ascii="Calibri" w:hAnsi="Calibri"/>
+          <w:b/>
+          <w:sz w:val="23"/>
+        </w:rPr>
+        <w:t>National Institute for Micro, Small and Medium Enterprises (ni-msme) strengthens MSMEs through Capacity Building, Entrepreneurship Development and Digital Empowerment</w:t>
+        <w:br/>
+      </w:r>
+    </w:p>
+    <w:p>
+      <w:pPr>
+        <w:spacing w:after="40"/>
+        <w:ind w:left="576"/>
+      </w:pPr>
+      <w:r>
+        <w:rPr>
+          <w:i/>
+          <w:color w:val="64748B"/>
+          <w:sz w:val="19"/>
+        </w:rPr>
+        <w:t>Ministry: Ministry of Micro,Small &amp; Medium Enterprises  |  Keywords: msme</w:t>
+        <w:br/>
+      </w:r>
+      <w:r>
+        <w:rPr>
+          <w:b/>
+          <w:color w:val="1E40AF"/>
+          <w:sz w:val="20"/>
+        </w:rPr>
+        <w:t>UPSC Alignment: Aligned with General Studies 3 topics: msme</w:t>
+        <w:br/>
+      </w:r>
+      <w:r>
+        <w:rPr>
+          <w:b/>
+          <w:color w:val="475569"/>
+          <w:sz w:val="18"/>
+        </w:rPr>
+        <w:t xml:space="preserve">Official PIB Link: </w:t>
+      </w:r>
+      <w:hyperlink r:id="rId21">
+        <w:r>
+          <w:rPr>
+            <w:color w:val="0284C7"/>
+            <w:u w:val="single"/>
+            <w:sz w:val="18"/>
+          </w:rPr>
+          <w:t>https://www.pib.gov.in/PressReleaseDetail.aspx?PRID=2326147</w:t>
+        </w:r>
+      </w:hyperlink>
+      <w:r>
+        <w:br/>
+      </w:r>
+    </w:p>
+    <w:p>
+      <w:pPr>
+        <w:spacing w:before="80" w:after="40"/>
+        <w:ind w:left="288"/>
+      </w:pPr>
+      <w:r>
+        <w:rPr>
+          <w:b/>
+        </w:rPr>
+        <w:t xml:space="preserve">12. </w:t>
+      </w:r>
+      <w:r>
+        <w:rPr>
+          <w:rFonts w:ascii="Calibri" w:hAnsi="Calibri"/>
+          <w:b/>
+          <w:sz w:val="23"/>
+        </w:rPr>
+        <w:t>India hosts Agrivoltaics World Conference 2026</w:t>
+        <w:br/>
+      </w:r>
+    </w:p>
+    <w:p>
+      <w:pPr>
+        <w:spacing w:after="40"/>
+        <w:ind w:left="576"/>
+      </w:pPr>
+      <w:r>
+        <w:rPr>
+          <w:i/>
+          <w:color w:val="64748B"/>
+          <w:sz w:val="19"/>
+        </w:rPr>
+        <w:t>Ministry: Ministry of New and Renewable Energy  |  Keywords: renewable energy</w:t>
+        <w:br/>
+      </w:r>
+      <w:r>
+        <w:rPr>
+          <w:b/>
+          <w:color w:val="1E40AF"/>
+          <w:sz w:val="20"/>
+        </w:rPr>
+        <w:t>UPSC Alignment: Aligned with General Studies 3 topics: renewable energy</w:t>
+        <w:br/>
+      </w:r>
+      <w:r>
+        <w:rPr>
+          <w:b/>
+          <w:color w:val="475569"/>
+          <w:sz w:val="18"/>
+        </w:rPr>
+        <w:t xml:space="preserve">Official PIB Link: </w:t>
+      </w:r>
+      <w:hyperlink r:id="rId22">
+        <w:r>
+          <w:rPr>
+            <w:color w:val="0284C7"/>
+            <w:u w:val="single"/>
+            <w:sz w:val="18"/>
+          </w:rPr>
+          <w:t>https://www.pib.gov.in/PressReleaseDetail.aspx?PRID=2326072</w:t>
+        </w:r>
+      </w:hyperlink>
+      <w:r>
+        <w:br/>
+      </w:r>
+    </w:p>
+    <w:p>
+      <w:pPr>
+        <w:spacing w:before="80" w:after="40"/>
+        <w:ind w:left="288"/>
+      </w:pPr>
+      <w:r>
+        <w:rPr>
+          <w:b/>
+        </w:rPr>
+        <w:t xml:space="preserve">13. </w:t>
+      </w:r>
+      <w:r>
+        <w:rPr>
+          <w:rFonts w:ascii="Calibri" w:hAnsi="Calibri"/>
+          <w:b/>
+          <w:sz w:val="23"/>
+        </w:rPr>
+        <w:t>India hosts Agrivoltaics World Conference 2026 for the first time in the Global South</w:t>
+        <w:br/>
+      </w:r>
+    </w:p>
+    <w:p>
+      <w:pPr>
+        <w:spacing w:after="40"/>
+        <w:ind w:left="576"/>
+      </w:pPr>
+      <w:r>
+        <w:rPr>
+          <w:i/>
+          <w:color w:val="64748B"/>
+          <w:sz w:val="19"/>
+        </w:rPr>
+        <w:t>Ministry: Ministry of New and Renewable Energy  |  Keywords: renewable energy</w:t>
+        <w:br/>
+      </w:r>
+      <w:r>
+        <w:rPr>
+          <w:b/>
+          <w:color w:val="1E40AF"/>
+          <w:sz w:val="20"/>
+        </w:rPr>
+        <w:t>UPSC Alignment: Aligned with General Studies 3 topics: renewable energy</w:t>
+        <w:br/>
+      </w:r>
+      <w:r>
+        <w:rPr>
+          <w:b/>
+          <w:color w:val="475569"/>
+          <w:sz w:val="18"/>
+        </w:rPr>
+        <w:t xml:space="preserve">Official PIB Link: </w:t>
+      </w:r>
+      <w:hyperlink r:id="rId23">
+        <w:r>
+          <w:rPr>
+            <w:color w:val="0284C7"/>
+            <w:u w:val="single"/>
+            <w:sz w:val="18"/>
+          </w:rPr>
+          <w:t>https://www.pib.gov.in/PressReleaseDetail.aspx?PRID=2326059</w:t>
+        </w:r>
+      </w:hyperlink>
+      <w:r>
+        <w:br/>
+      </w:r>
+    </w:p>
+    <w:p>
+      <w:pPr>
+        <w:spacing w:before="80" w:after="40"/>
+        <w:ind w:left="288"/>
+      </w:pPr>
+      <w:r>
+        <w:rPr>
+          <w:b/>
+        </w:rPr>
+        <w:t xml:space="preserve">14. </w:t>
       </w:r>
       <w:r>
         <w:rPr>
@@ -345,7 +1157,7 @@
         </w:rPr>
         <w:t xml:space="preserve">Official PIB Link: </w:t>
       </w:r>
-      <w:hyperlink r:id="rId12">
+      <w:hyperlink r:id="rId24">
         <w:r>
           <w:rPr>
             <w:color w:val="0284C7"/>

</xml_diff>